<commit_message>
Laporan: tautan portofolio repositori K-2
Co-Authored-By: Claude Code <noreply@anthropic.com>
</commit_message>
<xml_diff>
--- a/results/IF-3C_K-2_250660121068_Dendy Zainal Mutaqien.docx
+++ b/results/IF-3C_K-2_250660121068_Dendy Zainal Mutaqien.docx
@@ -6825,12 +6825,13 @@
             <w:pPr>
               <w:spacing w:before="40" w:after="40"/>
             </w:pPr>
-            <w:r/>
+            <w:r>
+              <w:t>https://github.com/ZzDendy/so-k2-penjadwalan</w:t>
+            </w:r>
             <w:r>
               <w:rPr>
                 <w:sz w:val="18"/>
               </w:rPr>
-              <w:t>[tautan repositori K-2]</w:t>
             </w:r>
           </w:p>
         </w:tc>

</xml_diff>

<commit_message>
Lampiran D: tiga anggota dan perataan sel tabel
Sel tabel mewarisi justify dari gaya Normal, sehingga kolom sempit
merentangkan kata. Semua sel sekarang rata kiri.

Co-Authored-By: Claude Code <noreply@anthropic.com>
</commit_message>
<xml_diff>
--- a/results/IF-3C_K-2_250660121068_Dendy Zainal Mutaqien.docx
+++ b/results/IF-3C_K-2_250660121068_Dendy Zainal Mutaqien.docx
@@ -78,6 +78,7 @@
           <w:p>
             <w:pPr>
               <w:spacing w:before="40" w:after="40"/>
+              <w:jc w:val="left"/>
             </w:pPr>
             <w:r/>
             <w:r>
@@ -97,6 +98,7 @@
           <w:p>
             <w:pPr>
               <w:spacing w:before="40" w:after="40"/>
+              <w:jc w:val="left"/>
             </w:pPr>
             <w:r/>
             <w:r>
@@ -120,6 +122,7 @@
           <w:p>
             <w:pPr>
               <w:spacing w:before="40" w:after="40"/>
+              <w:jc w:val="left"/>
             </w:pPr>
             <w:r/>
             <w:r>
@@ -137,6 +140,7 @@
           <w:p>
             <w:pPr>
               <w:spacing w:before="40" w:after="40"/>
+              <w:jc w:val="left"/>
             </w:pPr>
             <w:r/>
             <w:r>
@@ -159,6 +163,7 @@
           <w:p>
             <w:pPr>
               <w:spacing w:before="40" w:after="40"/>
+              <w:jc w:val="left"/>
             </w:pPr>
             <w:r/>
             <w:r>
@@ -176,6 +181,7 @@
           <w:p>
             <w:pPr>
               <w:spacing w:before="40" w:after="40"/>
+              <w:jc w:val="left"/>
             </w:pPr>
             <w:r/>
             <w:r>
@@ -198,6 +204,7 @@
           <w:p>
             <w:pPr>
               <w:spacing w:before="40" w:after="40"/>
+              <w:jc w:val="left"/>
             </w:pPr>
             <w:r/>
             <w:r>
@@ -215,6 +222,7 @@
           <w:p>
             <w:pPr>
               <w:spacing w:before="40" w:after="40"/>
+              <w:jc w:val="left"/>
             </w:pPr>
             <w:r/>
             <w:r>
@@ -237,6 +245,7 @@
           <w:p>
             <w:pPr>
               <w:spacing w:before="40" w:after="40"/>
+              <w:jc w:val="left"/>
             </w:pPr>
             <w:r/>
             <w:r>
@@ -254,6 +263,7 @@
           <w:p>
             <w:pPr>
               <w:spacing w:before="40" w:after="40"/>
+              <w:jc w:val="left"/>
             </w:pPr>
             <w:r/>
             <w:r>
@@ -276,6 +286,7 @@
           <w:p>
             <w:pPr>
               <w:spacing w:before="40" w:after="40"/>
+              <w:jc w:val="left"/>
             </w:pPr>
             <w:r/>
             <w:r>
@@ -293,13 +304,15 @@
           <w:p>
             <w:pPr>
               <w:spacing w:before="40" w:after="40"/>
-            </w:pPr>
-            <w:r/>
+              <w:jc w:val="left"/>
+            </w:pPr>
+            <w:r>
+              <w:t>3 orang — Dendy Zainal Mutaqien, R.Sangga Buana, M.Azkal Azkiya (rincian di Lampiran D)</w:t>
+            </w:r>
             <w:r>
               <w:rPr>
                 <w:sz w:val="19"/>
               </w:rPr>
-              <w:t>1 orang (rincian di Lampiran D)</w:t>
             </w:r>
           </w:p>
         </w:tc>
@@ -315,6 +328,7 @@
           <w:p>
             <w:pPr>
               <w:spacing w:before="40" w:after="40"/>
+              <w:jc w:val="left"/>
             </w:pPr>
             <w:r/>
             <w:r>
@@ -332,6 +346,7 @@
           <w:p>
             <w:pPr>
               <w:spacing w:before="40" w:after="40"/>
+              <w:jc w:val="left"/>
             </w:pPr>
             <w:r/>
             <w:r>
@@ -354,6 +369,7 @@
           <w:p>
             <w:pPr>
               <w:spacing w:before="40" w:after="40"/>
+              <w:jc w:val="left"/>
             </w:pPr>
             <w:r/>
             <w:r>
@@ -371,6 +387,7 @@
           <w:p>
             <w:pPr>
               <w:spacing w:before="40" w:after="40"/>
+              <w:jc w:val="left"/>
             </w:pPr>
             <w:r/>
             <w:r>
@@ -393,6 +410,7 @@
           <w:p>
             <w:pPr>
               <w:spacing w:before="40" w:after="40"/>
+              <w:jc w:val="left"/>
             </w:pPr>
             <w:r/>
             <w:r>
@@ -410,6 +428,7 @@
           <w:p>
             <w:pPr>
               <w:spacing w:before="40" w:after="40"/>
+              <w:jc w:val="left"/>
             </w:pPr>
             <w:r/>
             <w:r>
@@ -432,6 +451,7 @@
           <w:p>
             <w:pPr>
               <w:spacing w:before="40" w:after="40"/>
+              <w:jc w:val="left"/>
             </w:pPr>
             <w:r/>
             <w:r>
@@ -449,6 +469,7 @@
           <w:p>
             <w:pPr>
               <w:spacing w:before="40" w:after="40"/>
+              <w:jc w:val="left"/>
             </w:pPr>
             <w:r/>
             <w:r>
@@ -1165,6 +1186,7 @@
           <w:p>
             <w:pPr>
               <w:spacing w:before="40" w:after="40"/>
+              <w:jc w:val="left"/>
             </w:pPr>
             <w:r/>
             <w:r>
@@ -1184,6 +1206,7 @@
           <w:p>
             <w:pPr>
               <w:spacing w:before="40" w:after="40"/>
+              <w:jc w:val="left"/>
             </w:pPr>
             <w:r/>
             <w:r>
@@ -1207,6 +1230,7 @@
           <w:p>
             <w:pPr>
               <w:spacing w:before="40" w:after="40"/>
+              <w:jc w:val="left"/>
             </w:pPr>
             <w:r/>
             <w:r>
@@ -1224,6 +1248,7 @@
           <w:p>
             <w:pPr>
               <w:spacing w:before="40" w:after="40"/>
+              <w:jc w:val="left"/>
             </w:pPr>
             <w:r/>
             <w:r>
@@ -1246,6 +1271,7 @@
           <w:p>
             <w:pPr>
               <w:spacing w:before="40" w:after="40"/>
+              <w:jc w:val="left"/>
             </w:pPr>
             <w:r/>
             <w:r>
@@ -1263,6 +1289,7 @@
           <w:p>
             <w:pPr>
               <w:spacing w:before="40" w:after="40"/>
+              <w:jc w:val="left"/>
             </w:pPr>
             <w:r/>
             <w:r>
@@ -1285,6 +1312,7 @@
           <w:p>
             <w:pPr>
               <w:spacing w:before="40" w:after="40"/>
+              <w:jc w:val="left"/>
             </w:pPr>
             <w:r/>
             <w:r>
@@ -1302,6 +1330,7 @@
           <w:p>
             <w:pPr>
               <w:spacing w:before="40" w:after="40"/>
+              <w:jc w:val="left"/>
             </w:pPr>
             <w:r/>
             <w:r>
@@ -1324,6 +1353,7 @@
           <w:p>
             <w:pPr>
               <w:spacing w:before="40" w:after="40"/>
+              <w:jc w:val="left"/>
             </w:pPr>
             <w:r/>
             <w:r>
@@ -1341,6 +1371,7 @@
           <w:p>
             <w:pPr>
               <w:spacing w:before="40" w:after="40"/>
+              <w:jc w:val="left"/>
             </w:pPr>
             <w:r/>
             <w:r>
@@ -1363,6 +1394,7 @@
           <w:p>
             <w:pPr>
               <w:spacing w:before="40" w:after="40"/>
+              <w:jc w:val="left"/>
             </w:pPr>
             <w:r/>
             <w:r>
@@ -1380,6 +1412,7 @@
           <w:p>
             <w:pPr>
               <w:spacing w:before="40" w:after="40"/>
+              <w:jc w:val="left"/>
             </w:pPr>
             <w:r/>
             <w:r>
@@ -1402,6 +1435,7 @@
           <w:p>
             <w:pPr>
               <w:spacing w:before="40" w:after="40"/>
+              <w:jc w:val="left"/>
             </w:pPr>
             <w:r/>
             <w:r>
@@ -1419,6 +1453,7 @@
           <w:p>
             <w:pPr>
               <w:spacing w:before="40" w:after="40"/>
+              <w:jc w:val="left"/>
             </w:pPr>
             <w:r/>
             <w:r>
@@ -3839,6 +3874,7 @@
           <w:p>
             <w:pPr>
               <w:spacing w:before="40" w:after="40"/>
+              <w:jc w:val="left"/>
             </w:pPr>
             <w:r/>
             <w:r>
@@ -3858,6 +3894,7 @@
           <w:p>
             <w:pPr>
               <w:spacing w:before="40" w:after="40"/>
+              <w:jc w:val="left"/>
             </w:pPr>
             <w:r/>
             <w:r>
@@ -3877,6 +3914,7 @@
           <w:p>
             <w:pPr>
               <w:spacing w:before="40" w:after="40"/>
+              <w:jc w:val="left"/>
             </w:pPr>
             <w:r/>
             <w:r>
@@ -3896,6 +3934,7 @@
           <w:p>
             <w:pPr>
               <w:spacing w:before="40" w:after="40"/>
+              <w:jc w:val="left"/>
             </w:pPr>
             <w:r/>
             <w:r>
@@ -3919,6 +3958,7 @@
           <w:p>
             <w:pPr>
               <w:spacing w:before="40" w:after="40"/>
+              <w:jc w:val="left"/>
             </w:pPr>
             <w:r/>
             <w:r>
@@ -3936,6 +3976,7 @@
           <w:p>
             <w:pPr>
               <w:spacing w:before="40" w:after="40"/>
+              <w:jc w:val="left"/>
             </w:pPr>
             <w:r/>
             <w:r>
@@ -3953,6 +3994,7 @@
           <w:p>
             <w:pPr>
               <w:spacing w:before="40" w:after="40"/>
+              <w:jc w:val="left"/>
             </w:pPr>
             <w:r/>
             <w:r>
@@ -3970,6 +4012,7 @@
           <w:p>
             <w:pPr>
               <w:spacing w:before="40" w:after="40"/>
+              <w:jc w:val="left"/>
             </w:pPr>
             <w:r/>
             <w:r>
@@ -3992,6 +4035,7 @@
           <w:p>
             <w:pPr>
               <w:spacing w:before="40" w:after="40"/>
+              <w:jc w:val="left"/>
             </w:pPr>
             <w:r/>
             <w:r>
@@ -4009,6 +4053,7 @@
           <w:p>
             <w:pPr>
               <w:spacing w:before="40" w:after="40"/>
+              <w:jc w:val="left"/>
             </w:pPr>
             <w:r/>
             <w:r>
@@ -4026,6 +4071,7 @@
           <w:p>
             <w:pPr>
               <w:spacing w:before="40" w:after="40"/>
+              <w:jc w:val="left"/>
             </w:pPr>
             <w:r/>
             <w:r>
@@ -4043,6 +4089,7 @@
           <w:p>
             <w:pPr>
               <w:spacing w:before="40" w:after="40"/>
+              <w:jc w:val="left"/>
             </w:pPr>
             <w:r/>
             <w:r>
@@ -4065,6 +4112,7 @@
           <w:p>
             <w:pPr>
               <w:spacing w:before="40" w:after="40"/>
+              <w:jc w:val="left"/>
             </w:pPr>
             <w:r/>
             <w:r>
@@ -4082,6 +4130,7 @@
           <w:p>
             <w:pPr>
               <w:spacing w:before="40" w:after="40"/>
+              <w:jc w:val="left"/>
             </w:pPr>
             <w:r/>
             <w:r>
@@ -4099,6 +4148,7 @@
           <w:p>
             <w:pPr>
               <w:spacing w:before="40" w:after="40"/>
+              <w:jc w:val="left"/>
             </w:pPr>
             <w:r/>
             <w:r>
@@ -4116,6 +4166,7 @@
           <w:p>
             <w:pPr>
               <w:spacing w:before="40" w:after="40"/>
+              <w:jc w:val="left"/>
             </w:pPr>
             <w:r/>
             <w:r>
@@ -4138,6 +4189,7 @@
           <w:p>
             <w:pPr>
               <w:spacing w:before="40" w:after="40"/>
+              <w:jc w:val="left"/>
             </w:pPr>
             <w:r/>
             <w:r>
@@ -4155,6 +4207,7 @@
           <w:p>
             <w:pPr>
               <w:spacing w:before="40" w:after="40"/>
+              <w:jc w:val="left"/>
             </w:pPr>
             <w:r/>
             <w:r>
@@ -4172,6 +4225,7 @@
           <w:p>
             <w:pPr>
               <w:spacing w:before="40" w:after="40"/>
+              <w:jc w:val="left"/>
             </w:pPr>
             <w:r/>
             <w:r>
@@ -4189,6 +4243,7 @@
           <w:p>
             <w:pPr>
               <w:spacing w:before="40" w:after="40"/>
+              <w:jc w:val="left"/>
             </w:pPr>
             <w:r/>
             <w:r>
@@ -4211,6 +4266,7 @@
           <w:p>
             <w:pPr>
               <w:spacing w:before="40" w:after="40"/>
+              <w:jc w:val="left"/>
             </w:pPr>
             <w:r/>
             <w:r>
@@ -4228,6 +4284,7 @@
           <w:p>
             <w:pPr>
               <w:spacing w:before="40" w:after="40"/>
+              <w:jc w:val="left"/>
             </w:pPr>
             <w:r/>
             <w:r>
@@ -4245,6 +4302,7 @@
           <w:p>
             <w:pPr>
               <w:spacing w:before="40" w:after="40"/>
+              <w:jc w:val="left"/>
             </w:pPr>
             <w:r/>
             <w:r>
@@ -4262,6 +4320,7 @@
           <w:p>
             <w:pPr>
               <w:spacing w:before="40" w:after="40"/>
+              <w:jc w:val="left"/>
             </w:pPr>
             <w:r/>
             <w:r>
@@ -4284,6 +4343,7 @@
           <w:p>
             <w:pPr>
               <w:spacing w:before="40" w:after="40"/>
+              <w:jc w:val="left"/>
             </w:pPr>
             <w:r/>
             <w:r>
@@ -4301,6 +4361,7 @@
           <w:p>
             <w:pPr>
               <w:spacing w:before="40" w:after="40"/>
+              <w:jc w:val="left"/>
             </w:pPr>
             <w:r/>
             <w:r>
@@ -4318,6 +4379,7 @@
           <w:p>
             <w:pPr>
               <w:spacing w:before="40" w:after="40"/>
+              <w:jc w:val="left"/>
             </w:pPr>
             <w:r/>
             <w:r>
@@ -4335,6 +4397,7 @@
           <w:p>
             <w:pPr>
               <w:spacing w:before="40" w:after="40"/>
+              <w:jc w:val="left"/>
             </w:pPr>
             <w:r/>
             <w:r>
@@ -4549,6 +4612,7 @@
           <w:p>
             <w:pPr>
               <w:spacing w:before="40" w:after="40"/>
+              <w:jc w:val="left"/>
             </w:pPr>
             <w:r/>
             <w:r>
@@ -4568,6 +4632,7 @@
           <w:p>
             <w:pPr>
               <w:spacing w:before="40" w:after="40"/>
+              <w:jc w:val="left"/>
             </w:pPr>
             <w:r/>
             <w:r>
@@ -4587,6 +4652,7 @@
           <w:p>
             <w:pPr>
               <w:spacing w:before="40" w:after="40"/>
+              <w:jc w:val="left"/>
             </w:pPr>
             <w:r/>
             <w:r>
@@ -4606,6 +4672,7 @@
           <w:p>
             <w:pPr>
               <w:spacing w:before="40" w:after="40"/>
+              <w:jc w:val="left"/>
             </w:pPr>
             <w:r/>
             <w:r>
@@ -4625,6 +4692,7 @@
           <w:p>
             <w:pPr>
               <w:spacing w:before="40" w:after="40"/>
+              <w:jc w:val="left"/>
             </w:pPr>
             <w:r/>
             <w:r>
@@ -4644,6 +4712,7 @@
           <w:p>
             <w:pPr>
               <w:spacing w:before="40" w:after="40"/>
+              <w:jc w:val="left"/>
             </w:pPr>
             <w:r/>
             <w:r>
@@ -4663,6 +4732,7 @@
           <w:p>
             <w:pPr>
               <w:spacing w:before="40" w:after="40"/>
+              <w:jc w:val="left"/>
             </w:pPr>
             <w:r/>
             <w:r>
@@ -4682,6 +4752,7 @@
           <w:p>
             <w:pPr>
               <w:spacing w:before="40" w:after="40"/>
+              <w:jc w:val="left"/>
             </w:pPr>
             <w:r/>
             <w:r>
@@ -4701,6 +4772,7 @@
           <w:p>
             <w:pPr>
               <w:spacing w:before="40" w:after="40"/>
+              <w:jc w:val="left"/>
             </w:pPr>
             <w:r/>
             <w:r>
@@ -4720,6 +4792,7 @@
           <w:p>
             <w:pPr>
               <w:spacing w:before="40" w:after="40"/>
+              <w:jc w:val="left"/>
             </w:pPr>
             <w:r/>
             <w:r>
@@ -4743,6 +4816,7 @@
           <w:p>
             <w:pPr>
               <w:spacing w:before="40" w:after="40"/>
+              <w:jc w:val="left"/>
             </w:pPr>
             <w:r/>
             <w:r>
@@ -4760,6 +4834,7 @@
           <w:p>
             <w:pPr>
               <w:spacing w:before="40" w:after="40"/>
+              <w:jc w:val="left"/>
             </w:pPr>
             <w:r/>
             <w:r>
@@ -4777,6 +4852,7 @@
           <w:p>
             <w:pPr>
               <w:spacing w:before="40" w:after="40"/>
+              <w:jc w:val="left"/>
             </w:pPr>
             <w:r/>
             <w:r>
@@ -4794,6 +4870,7 @@
           <w:p>
             <w:pPr>
               <w:spacing w:before="40" w:after="40"/>
+              <w:jc w:val="left"/>
             </w:pPr>
             <w:r/>
             <w:r>
@@ -4811,6 +4888,7 @@
           <w:p>
             <w:pPr>
               <w:spacing w:before="40" w:after="40"/>
+              <w:jc w:val="left"/>
             </w:pPr>
             <w:r/>
             <w:r>
@@ -4828,6 +4906,7 @@
           <w:p>
             <w:pPr>
               <w:spacing w:before="40" w:after="40"/>
+              <w:jc w:val="left"/>
             </w:pPr>
             <w:r/>
             <w:r>
@@ -4845,6 +4924,7 @@
           <w:p>
             <w:pPr>
               <w:spacing w:before="40" w:after="40"/>
+              <w:jc w:val="left"/>
             </w:pPr>
             <w:r/>
             <w:r>
@@ -4862,6 +4942,7 @@
           <w:p>
             <w:pPr>
               <w:spacing w:before="40" w:after="40"/>
+              <w:jc w:val="left"/>
             </w:pPr>
             <w:r/>
             <w:r>
@@ -4879,6 +4960,7 @@
           <w:p>
             <w:pPr>
               <w:spacing w:before="40" w:after="40"/>
+              <w:jc w:val="left"/>
             </w:pPr>
             <w:r/>
             <w:r>
@@ -4896,6 +4978,7 @@
           <w:p>
             <w:pPr>
               <w:spacing w:before="40" w:after="40"/>
+              <w:jc w:val="left"/>
             </w:pPr>
             <w:r/>
             <w:r>
@@ -4918,6 +5001,7 @@
           <w:p>
             <w:pPr>
               <w:spacing w:before="40" w:after="40"/>
+              <w:jc w:val="left"/>
             </w:pPr>
             <w:r/>
             <w:r>
@@ -4935,6 +5019,7 @@
           <w:p>
             <w:pPr>
               <w:spacing w:before="40" w:after="40"/>
+              <w:jc w:val="left"/>
             </w:pPr>
             <w:r/>
             <w:r>
@@ -4952,6 +5037,7 @@
           <w:p>
             <w:pPr>
               <w:spacing w:before="40" w:after="40"/>
+              <w:jc w:val="left"/>
             </w:pPr>
             <w:r/>
             <w:r>
@@ -4969,6 +5055,7 @@
           <w:p>
             <w:pPr>
               <w:spacing w:before="40" w:after="40"/>
+              <w:jc w:val="left"/>
             </w:pPr>
             <w:r/>
             <w:r>
@@ -4986,6 +5073,7 @@
           <w:p>
             <w:pPr>
               <w:spacing w:before="40" w:after="40"/>
+              <w:jc w:val="left"/>
             </w:pPr>
             <w:r/>
             <w:r>
@@ -5003,6 +5091,7 @@
           <w:p>
             <w:pPr>
               <w:spacing w:before="40" w:after="40"/>
+              <w:jc w:val="left"/>
             </w:pPr>
             <w:r/>
             <w:r>
@@ -5020,6 +5109,7 @@
           <w:p>
             <w:pPr>
               <w:spacing w:before="40" w:after="40"/>
+              <w:jc w:val="left"/>
             </w:pPr>
             <w:r/>
             <w:r>
@@ -5037,6 +5127,7 @@
           <w:p>
             <w:pPr>
               <w:spacing w:before="40" w:after="40"/>
+              <w:jc w:val="left"/>
             </w:pPr>
             <w:r/>
             <w:r>
@@ -5054,6 +5145,7 @@
           <w:p>
             <w:pPr>
               <w:spacing w:before="40" w:after="40"/>
+              <w:jc w:val="left"/>
             </w:pPr>
             <w:r/>
             <w:r>
@@ -5071,6 +5163,7 @@
           <w:p>
             <w:pPr>
               <w:spacing w:before="40" w:after="40"/>
+              <w:jc w:val="left"/>
             </w:pPr>
             <w:r/>
             <w:r>
@@ -5093,6 +5186,7 @@
           <w:p>
             <w:pPr>
               <w:spacing w:before="40" w:after="40"/>
+              <w:jc w:val="left"/>
             </w:pPr>
             <w:r/>
             <w:r>
@@ -5110,6 +5204,7 @@
           <w:p>
             <w:pPr>
               <w:spacing w:before="40" w:after="40"/>
+              <w:jc w:val="left"/>
             </w:pPr>
             <w:r/>
             <w:r>
@@ -5127,6 +5222,7 @@
           <w:p>
             <w:pPr>
               <w:spacing w:before="40" w:after="40"/>
+              <w:jc w:val="left"/>
             </w:pPr>
             <w:r/>
             <w:r>
@@ -5144,6 +5240,7 @@
           <w:p>
             <w:pPr>
               <w:spacing w:before="40" w:after="40"/>
+              <w:jc w:val="left"/>
             </w:pPr>
             <w:r/>
             <w:r>
@@ -5161,6 +5258,7 @@
           <w:p>
             <w:pPr>
               <w:spacing w:before="40" w:after="40"/>
+              <w:jc w:val="left"/>
             </w:pPr>
             <w:r/>
             <w:r>
@@ -5178,6 +5276,7 @@
           <w:p>
             <w:pPr>
               <w:spacing w:before="40" w:after="40"/>
+              <w:jc w:val="left"/>
             </w:pPr>
             <w:r/>
             <w:r>
@@ -5195,6 +5294,7 @@
           <w:p>
             <w:pPr>
               <w:spacing w:before="40" w:after="40"/>
+              <w:jc w:val="left"/>
             </w:pPr>
             <w:r/>
             <w:r>
@@ -5212,6 +5312,7 @@
           <w:p>
             <w:pPr>
               <w:spacing w:before="40" w:after="40"/>
+              <w:jc w:val="left"/>
             </w:pPr>
             <w:r/>
             <w:r>
@@ -5229,6 +5330,7 @@
           <w:p>
             <w:pPr>
               <w:spacing w:before="40" w:after="40"/>
+              <w:jc w:val="left"/>
             </w:pPr>
             <w:r/>
             <w:r>
@@ -5246,6 +5348,7 @@
           <w:p>
             <w:pPr>
               <w:spacing w:before="40" w:after="40"/>
+              <w:jc w:val="left"/>
             </w:pPr>
             <w:r/>
             <w:r>
@@ -5268,6 +5371,7 @@
           <w:p>
             <w:pPr>
               <w:spacing w:before="40" w:after="40"/>
+              <w:jc w:val="left"/>
             </w:pPr>
             <w:r/>
             <w:r>
@@ -5285,6 +5389,7 @@
           <w:p>
             <w:pPr>
               <w:spacing w:before="40" w:after="40"/>
+              <w:jc w:val="left"/>
             </w:pPr>
             <w:r/>
             <w:r>
@@ -5302,6 +5407,7 @@
           <w:p>
             <w:pPr>
               <w:spacing w:before="40" w:after="40"/>
+              <w:jc w:val="left"/>
             </w:pPr>
             <w:r/>
             <w:r>
@@ -5319,6 +5425,7 @@
           <w:p>
             <w:pPr>
               <w:spacing w:before="40" w:after="40"/>
+              <w:jc w:val="left"/>
             </w:pPr>
             <w:r/>
             <w:r>
@@ -5336,6 +5443,7 @@
           <w:p>
             <w:pPr>
               <w:spacing w:before="40" w:after="40"/>
+              <w:jc w:val="left"/>
             </w:pPr>
             <w:r/>
             <w:r>
@@ -5353,6 +5461,7 @@
           <w:p>
             <w:pPr>
               <w:spacing w:before="40" w:after="40"/>
+              <w:jc w:val="left"/>
             </w:pPr>
             <w:r/>
             <w:r>
@@ -5370,6 +5479,7 @@
           <w:p>
             <w:pPr>
               <w:spacing w:before="40" w:after="40"/>
+              <w:jc w:val="left"/>
             </w:pPr>
             <w:r/>
             <w:r>
@@ -5387,6 +5497,7 @@
           <w:p>
             <w:pPr>
               <w:spacing w:before="40" w:after="40"/>
+              <w:jc w:val="left"/>
             </w:pPr>
             <w:r/>
             <w:r>
@@ -5404,6 +5515,7 @@
           <w:p>
             <w:pPr>
               <w:spacing w:before="40" w:after="40"/>
+              <w:jc w:val="left"/>
             </w:pPr>
             <w:r/>
             <w:r>
@@ -5421,6 +5533,7 @@
           <w:p>
             <w:pPr>
               <w:spacing w:before="40" w:after="40"/>
+              <w:jc w:val="left"/>
             </w:pPr>
             <w:r/>
             <w:r>
@@ -5443,6 +5556,7 @@
           <w:p>
             <w:pPr>
               <w:spacing w:before="40" w:after="40"/>
+              <w:jc w:val="left"/>
             </w:pPr>
             <w:r/>
             <w:r>
@@ -5460,6 +5574,7 @@
           <w:p>
             <w:pPr>
               <w:spacing w:before="40" w:after="40"/>
+              <w:jc w:val="left"/>
             </w:pPr>
             <w:r/>
             <w:r>
@@ -5477,6 +5592,7 @@
           <w:p>
             <w:pPr>
               <w:spacing w:before="40" w:after="40"/>
+              <w:jc w:val="left"/>
             </w:pPr>
             <w:r/>
             <w:r>
@@ -5494,6 +5610,7 @@
           <w:p>
             <w:pPr>
               <w:spacing w:before="40" w:after="40"/>
+              <w:jc w:val="left"/>
             </w:pPr>
             <w:r/>
             <w:r>
@@ -5511,6 +5628,7 @@
           <w:p>
             <w:pPr>
               <w:spacing w:before="40" w:after="40"/>
+              <w:jc w:val="left"/>
             </w:pPr>
             <w:r/>
             <w:r>
@@ -5528,6 +5646,7 @@
           <w:p>
             <w:pPr>
               <w:spacing w:before="40" w:after="40"/>
+              <w:jc w:val="left"/>
             </w:pPr>
             <w:r/>
             <w:r>
@@ -5545,6 +5664,7 @@
           <w:p>
             <w:pPr>
               <w:spacing w:before="40" w:after="40"/>
+              <w:jc w:val="left"/>
             </w:pPr>
             <w:r/>
             <w:r>
@@ -5562,6 +5682,7 @@
           <w:p>
             <w:pPr>
               <w:spacing w:before="40" w:after="40"/>
+              <w:jc w:val="left"/>
             </w:pPr>
             <w:r/>
             <w:r>
@@ -5579,6 +5700,7 @@
           <w:p>
             <w:pPr>
               <w:spacing w:before="40" w:after="40"/>
+              <w:jc w:val="left"/>
             </w:pPr>
             <w:r/>
             <w:r>
@@ -5596,6 +5718,7 @@
           <w:p>
             <w:pPr>
               <w:spacing w:before="40" w:after="40"/>
+              <w:jc w:val="left"/>
             </w:pPr>
             <w:r/>
             <w:r>
@@ -5618,6 +5741,7 @@
           <w:p>
             <w:pPr>
               <w:spacing w:before="40" w:after="40"/>
+              <w:jc w:val="left"/>
             </w:pPr>
             <w:r/>
             <w:r>
@@ -5635,6 +5759,7 @@
           <w:p>
             <w:pPr>
               <w:spacing w:before="40" w:after="40"/>
+              <w:jc w:val="left"/>
             </w:pPr>
             <w:r/>
             <w:r>
@@ -5652,6 +5777,7 @@
           <w:p>
             <w:pPr>
               <w:spacing w:before="40" w:after="40"/>
+              <w:jc w:val="left"/>
             </w:pPr>
             <w:r/>
             <w:r>
@@ -5669,6 +5795,7 @@
           <w:p>
             <w:pPr>
               <w:spacing w:before="40" w:after="40"/>
+              <w:jc w:val="left"/>
             </w:pPr>
             <w:r/>
             <w:r>
@@ -5686,6 +5813,7 @@
           <w:p>
             <w:pPr>
               <w:spacing w:before="40" w:after="40"/>
+              <w:jc w:val="left"/>
             </w:pPr>
             <w:r/>
             <w:r>
@@ -5703,6 +5831,7 @@
           <w:p>
             <w:pPr>
               <w:spacing w:before="40" w:after="40"/>
+              <w:jc w:val="left"/>
             </w:pPr>
             <w:r/>
             <w:r>
@@ -5720,6 +5849,7 @@
           <w:p>
             <w:pPr>
               <w:spacing w:before="40" w:after="40"/>
+              <w:jc w:val="left"/>
             </w:pPr>
             <w:r/>
             <w:r>
@@ -5737,6 +5867,7 @@
           <w:p>
             <w:pPr>
               <w:spacing w:before="40" w:after="40"/>
+              <w:jc w:val="left"/>
             </w:pPr>
             <w:r/>
             <w:r>
@@ -5754,6 +5885,7 @@
           <w:p>
             <w:pPr>
               <w:spacing w:before="40" w:after="40"/>
+              <w:jc w:val="left"/>
             </w:pPr>
             <w:r/>
             <w:r>
@@ -5771,6 +5903,7 @@
           <w:p>
             <w:pPr>
               <w:spacing w:before="40" w:after="40"/>
+              <w:jc w:val="left"/>
             </w:pPr>
             <w:r/>
             <w:r>
@@ -5793,6 +5926,7 @@
           <w:p>
             <w:pPr>
               <w:spacing w:before="40" w:after="40"/>
+              <w:jc w:val="left"/>
             </w:pPr>
             <w:r/>
             <w:r>
@@ -5810,6 +5944,7 @@
           <w:p>
             <w:pPr>
               <w:spacing w:before="40" w:after="40"/>
+              <w:jc w:val="left"/>
             </w:pPr>
             <w:r/>
             <w:r>
@@ -5827,6 +5962,7 @@
           <w:p>
             <w:pPr>
               <w:spacing w:before="40" w:after="40"/>
+              <w:jc w:val="left"/>
             </w:pPr>
             <w:r/>
             <w:r>
@@ -5844,6 +5980,7 @@
           <w:p>
             <w:pPr>
               <w:spacing w:before="40" w:after="40"/>
+              <w:jc w:val="left"/>
             </w:pPr>
             <w:r/>
             <w:r>
@@ -5861,6 +5998,7 @@
           <w:p>
             <w:pPr>
               <w:spacing w:before="40" w:after="40"/>
+              <w:jc w:val="left"/>
             </w:pPr>
             <w:r/>
             <w:r>
@@ -5878,6 +6016,7 @@
           <w:p>
             <w:pPr>
               <w:spacing w:before="40" w:after="40"/>
+              <w:jc w:val="left"/>
             </w:pPr>
             <w:r/>
             <w:r>
@@ -5895,6 +6034,7 @@
           <w:p>
             <w:pPr>
               <w:spacing w:before="40" w:after="40"/>
+              <w:jc w:val="left"/>
             </w:pPr>
             <w:r/>
             <w:r>
@@ -5912,6 +6052,7 @@
           <w:p>
             <w:pPr>
               <w:spacing w:before="40" w:after="40"/>
+              <w:jc w:val="left"/>
             </w:pPr>
             <w:r/>
             <w:r>
@@ -5929,6 +6070,7 @@
           <w:p>
             <w:pPr>
               <w:spacing w:before="40" w:after="40"/>
+              <w:jc w:val="left"/>
             </w:pPr>
             <w:r/>
             <w:r>
@@ -5946,6 +6088,7 @@
           <w:p>
             <w:pPr>
               <w:spacing w:before="40" w:after="40"/>
+              <w:jc w:val="left"/>
             </w:pPr>
             <w:r/>
             <w:r>
@@ -5968,6 +6111,7 @@
           <w:p>
             <w:pPr>
               <w:spacing w:before="40" w:after="40"/>
+              <w:jc w:val="left"/>
             </w:pPr>
             <w:r/>
             <w:r>
@@ -5985,6 +6129,7 @@
           <w:p>
             <w:pPr>
               <w:spacing w:before="40" w:after="40"/>
+              <w:jc w:val="left"/>
             </w:pPr>
             <w:r/>
             <w:r>
@@ -6002,6 +6147,7 @@
           <w:p>
             <w:pPr>
               <w:spacing w:before="40" w:after="40"/>
+              <w:jc w:val="left"/>
             </w:pPr>
             <w:r/>
             <w:r>
@@ -6019,6 +6165,7 @@
           <w:p>
             <w:pPr>
               <w:spacing w:before="40" w:after="40"/>
+              <w:jc w:val="left"/>
             </w:pPr>
             <w:r/>
             <w:r>
@@ -6036,6 +6183,7 @@
           <w:p>
             <w:pPr>
               <w:spacing w:before="40" w:after="40"/>
+              <w:jc w:val="left"/>
             </w:pPr>
             <w:r/>
             <w:r>
@@ -6053,6 +6201,7 @@
           <w:p>
             <w:pPr>
               <w:spacing w:before="40" w:after="40"/>
+              <w:jc w:val="left"/>
             </w:pPr>
             <w:r/>
             <w:r>
@@ -6070,6 +6219,7 @@
           <w:p>
             <w:pPr>
               <w:spacing w:before="40" w:after="40"/>
+              <w:jc w:val="left"/>
             </w:pPr>
             <w:r/>
             <w:r>
@@ -6087,6 +6237,7 @@
           <w:p>
             <w:pPr>
               <w:spacing w:before="40" w:after="40"/>
+              <w:jc w:val="left"/>
             </w:pPr>
             <w:r/>
             <w:r>
@@ -6104,6 +6255,7 @@
           <w:p>
             <w:pPr>
               <w:spacing w:before="40" w:after="40"/>
+              <w:jc w:val="left"/>
             </w:pPr>
             <w:r/>
             <w:r>
@@ -6121,6 +6273,7 @@
           <w:p>
             <w:pPr>
               <w:spacing w:before="40" w:after="40"/>
+              <w:jc w:val="left"/>
             </w:pPr>
             <w:r/>
             <w:r>
@@ -6143,6 +6296,7 @@
           <w:p>
             <w:pPr>
               <w:spacing w:before="40" w:after="40"/>
+              <w:jc w:val="left"/>
             </w:pPr>
             <w:r/>
             <w:r>
@@ -6160,6 +6314,7 @@
           <w:p>
             <w:pPr>
               <w:spacing w:before="40" w:after="40"/>
+              <w:jc w:val="left"/>
             </w:pPr>
             <w:r/>
             <w:r>
@@ -6177,6 +6332,7 @@
           <w:p>
             <w:pPr>
               <w:spacing w:before="40" w:after="40"/>
+              <w:jc w:val="left"/>
             </w:pPr>
             <w:r/>
             <w:r>
@@ -6194,6 +6350,7 @@
           <w:p>
             <w:pPr>
               <w:spacing w:before="40" w:after="40"/>
+              <w:jc w:val="left"/>
             </w:pPr>
             <w:r/>
             <w:r>
@@ -6211,6 +6368,7 @@
           <w:p>
             <w:pPr>
               <w:spacing w:before="40" w:after="40"/>
+              <w:jc w:val="left"/>
             </w:pPr>
             <w:r/>
             <w:r>
@@ -6228,6 +6386,7 @@
           <w:p>
             <w:pPr>
               <w:spacing w:before="40" w:after="40"/>
+              <w:jc w:val="left"/>
             </w:pPr>
             <w:r/>
             <w:r>
@@ -6245,6 +6404,7 @@
           <w:p>
             <w:pPr>
               <w:spacing w:before="40" w:after="40"/>
+              <w:jc w:val="left"/>
             </w:pPr>
             <w:r/>
             <w:r>
@@ -6262,6 +6422,7 @@
           <w:p>
             <w:pPr>
               <w:spacing w:before="40" w:after="40"/>
+              <w:jc w:val="left"/>
             </w:pPr>
             <w:r/>
             <w:r>
@@ -6279,6 +6440,7 @@
           <w:p>
             <w:pPr>
               <w:spacing w:before="40" w:after="40"/>
+              <w:jc w:val="left"/>
             </w:pPr>
             <w:r/>
             <w:r>
@@ -6296,6 +6458,7 @@
           <w:p>
             <w:pPr>
               <w:spacing w:before="40" w:after="40"/>
+              <w:jc w:val="left"/>
             </w:pPr>
             <w:r/>
             <w:r>
@@ -6318,6 +6481,7 @@
           <w:p>
             <w:pPr>
               <w:spacing w:before="40" w:after="40"/>
+              <w:jc w:val="left"/>
             </w:pPr>
             <w:r/>
             <w:r>
@@ -6335,6 +6499,7 @@
           <w:p>
             <w:pPr>
               <w:spacing w:before="40" w:after="40"/>
+              <w:jc w:val="left"/>
             </w:pPr>
             <w:r/>
             <w:r>
@@ -6352,6 +6517,7 @@
           <w:p>
             <w:pPr>
               <w:spacing w:before="40" w:after="40"/>
+              <w:jc w:val="left"/>
             </w:pPr>
             <w:r/>
             <w:r>
@@ -6369,6 +6535,7 @@
           <w:p>
             <w:pPr>
               <w:spacing w:before="40" w:after="40"/>
+              <w:jc w:val="left"/>
             </w:pPr>
             <w:r/>
             <w:r>
@@ -6386,6 +6553,7 @@
           <w:p>
             <w:pPr>
               <w:spacing w:before="40" w:after="40"/>
+              <w:jc w:val="left"/>
             </w:pPr>
             <w:r/>
             <w:r>
@@ -6403,6 +6571,7 @@
           <w:p>
             <w:pPr>
               <w:spacing w:before="40" w:after="40"/>
+              <w:jc w:val="left"/>
             </w:pPr>
             <w:r/>
             <w:r>
@@ -6420,6 +6589,7 @@
           <w:p>
             <w:pPr>
               <w:spacing w:before="40" w:after="40"/>
+              <w:jc w:val="left"/>
             </w:pPr>
             <w:r/>
             <w:r>
@@ -6437,6 +6607,7 @@
           <w:p>
             <w:pPr>
               <w:spacing w:before="40" w:after="40"/>
+              <w:jc w:val="left"/>
             </w:pPr>
             <w:r/>
             <w:r>
@@ -6454,6 +6625,7 @@
           <w:p>
             <w:pPr>
               <w:spacing w:before="40" w:after="40"/>
+              <w:jc w:val="left"/>
             </w:pPr>
             <w:r/>
             <w:r>
@@ -6471,6 +6643,7 @@
           <w:p>
             <w:pPr>
               <w:spacing w:before="40" w:after="40"/>
+              <w:jc w:val="left"/>
             </w:pPr>
             <w:r/>
             <w:r>
@@ -6687,6 +6860,7 @@
           <w:p>
             <w:pPr>
               <w:spacing w:before="40" w:after="40"/>
+              <w:jc w:val="left"/>
             </w:pPr>
             <w:r/>
             <w:r>
@@ -6706,6 +6880,7 @@
           <w:p>
             <w:pPr>
               <w:spacing w:before="40" w:after="40"/>
+              <w:jc w:val="left"/>
             </w:pPr>
             <w:r/>
             <w:r>
@@ -6729,6 +6904,7 @@
           <w:p>
             <w:pPr>
               <w:spacing w:before="40" w:after="40"/>
+              <w:jc w:val="left"/>
             </w:pPr>
             <w:r/>
             <w:r>
@@ -6746,6 +6922,7 @@
           <w:p>
             <w:pPr>
               <w:spacing w:before="40" w:after="40"/>
+              <w:jc w:val="left"/>
             </w:pPr>
             <w:r/>
             <w:r>
@@ -6768,6 +6945,7 @@
           <w:p>
             <w:pPr>
               <w:spacing w:before="40" w:after="40"/>
+              <w:jc w:val="left"/>
             </w:pPr>
             <w:r/>
             <w:r>
@@ -6785,6 +6963,7 @@
           <w:p>
             <w:pPr>
               <w:spacing w:before="40" w:after="40"/>
+              <w:jc w:val="left"/>
             </w:pPr>
             <w:r/>
             <w:r>
@@ -6807,6 +6986,7 @@
           <w:p>
             <w:pPr>
               <w:spacing w:before="40" w:after="40"/>
+              <w:jc w:val="left"/>
             </w:pPr>
             <w:r/>
             <w:r>
@@ -6824,6 +7004,7 @@
           <w:p>
             <w:pPr>
               <w:spacing w:before="40" w:after="40"/>
+              <w:jc w:val="left"/>
             </w:pPr>
             <w:r>
               <w:t>https://github.com/ZzDendy/so-k2-penjadwalan</w:t>
@@ -6847,6 +7028,7 @@
           <w:p>
             <w:pPr>
               <w:spacing w:before="40" w:after="40"/>
+              <w:jc w:val="left"/>
             </w:pPr>
             <w:r/>
             <w:r>
@@ -6864,6 +7046,7 @@
           <w:p>
             <w:pPr>
               <w:spacing w:before="40" w:after="40"/>
+              <w:jc w:val="left"/>
             </w:pPr>
             <w:r/>
             <w:r>
@@ -9216,6 +9399,7 @@
           <w:p>
             <w:pPr>
               <w:spacing w:before="40" w:after="40"/>
+              <w:jc w:val="left"/>
             </w:pPr>
             <w:r/>
             <w:r>
@@ -9235,6 +9419,7 @@
           <w:p>
             <w:pPr>
               <w:spacing w:before="40" w:after="40"/>
+              <w:jc w:val="left"/>
             </w:pPr>
             <w:r/>
             <w:r>
@@ -9254,6 +9439,7 @@
           <w:p>
             <w:pPr>
               <w:spacing w:before="40" w:after="40"/>
+              <w:jc w:val="left"/>
             </w:pPr>
             <w:r/>
             <w:r>
@@ -9273,6 +9459,7 @@
           <w:p>
             <w:pPr>
               <w:spacing w:before="40" w:after="40"/>
+              <w:jc w:val="left"/>
             </w:pPr>
             <w:r/>
             <w:r>
@@ -9296,6 +9483,7 @@
           <w:p>
             <w:pPr>
               <w:spacing w:before="40" w:after="40"/>
+              <w:jc w:val="left"/>
             </w:pPr>
             <w:r/>
             <w:r>
@@ -9313,6 +9501,7 @@
           <w:p>
             <w:pPr>
               <w:spacing w:before="40" w:after="40"/>
+              <w:jc w:val="left"/>
             </w:pPr>
             <w:r/>
             <w:r>
@@ -9330,6 +9519,7 @@
           <w:p>
             <w:pPr>
               <w:spacing w:before="40" w:after="40"/>
+              <w:jc w:val="left"/>
             </w:pPr>
             <w:r/>
             <w:r>
@@ -9347,6 +9537,7 @@
           <w:p>
             <w:pPr>
               <w:spacing w:before="40" w:after="40"/>
+              <w:jc w:val="left"/>
             </w:pPr>
             <w:r/>
             <w:r>
@@ -9490,6 +9681,7 @@
           <w:p>
             <w:pPr>
               <w:spacing w:before="40" w:after="40"/>
+              <w:jc w:val="left"/>
             </w:pPr>
             <w:r/>
             <w:r>
@@ -9509,6 +9701,7 @@
           <w:p>
             <w:pPr>
               <w:spacing w:before="40" w:after="40"/>
+              <w:jc w:val="left"/>
             </w:pPr>
             <w:r/>
             <w:r>
@@ -9528,6 +9721,7 @@
           <w:p>
             <w:pPr>
               <w:spacing w:before="40" w:after="40"/>
+              <w:jc w:val="left"/>
             </w:pPr>
             <w:r/>
             <w:r>
@@ -9551,6 +9745,7 @@
           <w:p>
             <w:pPr>
               <w:spacing w:before="40" w:after="40"/>
+              <w:jc w:val="left"/>
             </w:pPr>
             <w:r/>
             <w:r>
@@ -9568,6 +9763,7 @@
           <w:p>
             <w:pPr>
               <w:spacing w:before="40" w:after="40"/>
+              <w:jc w:val="left"/>
             </w:pPr>
             <w:r/>
             <w:r>
@@ -9585,6 +9781,7 @@
           <w:p>
             <w:pPr>
               <w:spacing w:before="40" w:after="40"/>
+              <w:jc w:val="left"/>
             </w:pPr>
             <w:r/>
             <w:r>
@@ -9607,6 +9804,7 @@
           <w:p>
             <w:pPr>
               <w:spacing w:before="40" w:after="40"/>
+              <w:jc w:val="left"/>
             </w:pPr>
             <w:r/>
             <w:r>
@@ -9624,6 +9822,7 @@
           <w:p>
             <w:pPr>
               <w:spacing w:before="40" w:after="40"/>
+              <w:jc w:val="left"/>
             </w:pPr>
             <w:r/>
             <w:r>
@@ -9641,6 +9840,7 @@
           <w:p>
             <w:pPr>
               <w:spacing w:before="40" w:after="40"/>
+              <w:jc w:val="left"/>
             </w:pPr>
             <w:r/>
             <w:r>
@@ -9663,6 +9863,7 @@
           <w:p>
             <w:pPr>
               <w:spacing w:before="40" w:after="40"/>
+              <w:jc w:val="left"/>
             </w:pPr>
             <w:r/>
             <w:r>
@@ -9680,6 +9881,7 @@
           <w:p>
             <w:pPr>
               <w:spacing w:before="40" w:after="40"/>
+              <w:jc w:val="left"/>
             </w:pPr>
             <w:r/>
             <w:r>
@@ -9697,6 +9899,7 @@
           <w:p>
             <w:pPr>
               <w:spacing w:before="40" w:after="40"/>
+              <w:jc w:val="left"/>
             </w:pPr>
             <w:r/>
             <w:r>
@@ -9719,6 +9922,7 @@
           <w:p>
             <w:pPr>
               <w:spacing w:before="40" w:after="40"/>
+              <w:jc w:val="left"/>
             </w:pPr>
             <w:r/>
             <w:r>
@@ -9736,6 +9940,7 @@
           <w:p>
             <w:pPr>
               <w:spacing w:before="40" w:after="40"/>
+              <w:jc w:val="left"/>
             </w:pPr>
             <w:r/>
             <w:r>
@@ -9753,6 +9958,7 @@
           <w:p>
             <w:pPr>
               <w:spacing w:before="40" w:after="40"/>
+              <w:jc w:val="left"/>
             </w:pPr>
             <w:r/>
             <w:r>
@@ -9826,6 +10032,7 @@
           <w:p>
             <w:pPr>
               <w:spacing w:before="40" w:after="40"/>
+              <w:jc w:val="left"/>
             </w:pPr>
             <w:r/>
             <w:r>
@@ -9845,6 +10052,7 @@
           <w:p>
             <w:pPr>
               <w:spacing w:before="40" w:after="40"/>
+              <w:jc w:val="left"/>
             </w:pPr>
             <w:r/>
             <w:r>
@@ -9864,6 +10072,7 @@
           <w:p>
             <w:pPr>
               <w:spacing w:before="40" w:after="40"/>
+              <w:jc w:val="left"/>
             </w:pPr>
             <w:r/>
             <w:r>
@@ -9877,22 +10086,16 @@
         </w:tc>
       </w:tr>
       <w:tr>
-        <w:trPr>
-          <w:cantSplit/>
-        </w:trPr>
         <w:tc>
           <w:tcPr>
             <w:tcW w:type="dxa" w:w="2494"/>
           </w:tcPr>
           <w:p>
             <w:pPr>
-              <w:spacing w:before="40" w:after="40"/>
-            </w:pPr>
-            <w:r/>
-            <w:r>
-              <w:rPr>
-                <w:sz w:val="18"/>
-              </w:rPr>
+              <w:jc w:val="left"/>
+            </w:pPr>
+            <w:r/>
+            <w:r>
               <w:t>Dendy Zainal Mutaqien</w:t>
             </w:r>
           </w:p>
@@ -9903,13 +10106,10 @@
           </w:tcPr>
           <w:p>
             <w:pPr>
-              <w:spacing w:before="40" w:after="40"/>
-            </w:pPr>
-            <w:r/>
-            <w:r>
-              <w:rPr>
-                <w:sz w:val="18"/>
-              </w:rPr>
+              <w:jc w:val="left"/>
+            </w:pPr>
+            <w:r/>
+            <w:r>
               <w:t>250660121068</w:t>
             </w:r>
           </w:p>
@@ -9920,14 +10120,99 @@
           </w:tcPr>
           <w:p>
             <w:pPr>
-              <w:spacing w:before="40" w:after="40"/>
-            </w:pPr>
-            <w:r/>
-            <w:r>
-              <w:rPr>
-                <w:sz w:val="18"/>
-              </w:rPr>
-              <w:t>Simulator, perhitungan manual, dan penyusunan laporan</w:t>
+              <w:jc w:val="left"/>
+            </w:pPr>
+            <w:r/>
+            <w:r>
+              <w:t>Simulator penjadwalan, perhitungan manual, dan penyusunan laporan</w:t>
+            </w:r>
+          </w:p>
+        </w:tc>
+      </w:tr>
+      <w:tr>
+        <w:tc>
+          <w:tcPr>
+            <w:tcW w:type="dxa" w:w="2494"/>
+          </w:tcPr>
+          <w:p>
+            <w:pPr>
+              <w:jc w:val="left"/>
+            </w:pPr>
+            <w:r/>
+            <w:r>
+              <w:t>R.Sangga Buana</w:t>
+            </w:r>
+          </w:p>
+        </w:tc>
+        <w:tc>
+          <w:tcPr>
+            <w:tcW w:type="dxa" w:w="1701"/>
+          </w:tcPr>
+          <w:p>
+            <w:pPr>
+              <w:jc w:val="left"/>
+            </w:pPr>
+            <w:r/>
+            <w:r>
+              <w:t>250660121021</w:t>
+            </w:r>
+          </w:p>
+        </w:tc>
+        <w:tc>
+          <w:tcPr>
+            <w:tcW w:type="dxa" w:w="4422"/>
+          </w:tcPr>
+          <w:p>
+            <w:pPr>
+              <w:jc w:val="left"/>
+            </w:pPr>
+            <w:r/>
+            <w:r>
+              <w:t>Membuat Gantt chart keenam algoritma dan memeriksa angka Tabel 5.1</w:t>
+            </w:r>
+          </w:p>
+        </w:tc>
+      </w:tr>
+      <w:tr>
+        <w:tc>
+          <w:tcPr>
+            <w:tcW w:type="dxa" w:w="2494"/>
+          </w:tcPr>
+          <w:p>
+            <w:pPr>
+              <w:jc w:val="left"/>
+            </w:pPr>
+            <w:r/>
+            <w:r>
+              <w:t>M.Azkal Azkiya</w:t>
+            </w:r>
+          </w:p>
+        </w:tc>
+        <w:tc>
+          <w:tcPr>
+            <w:tcW w:type="dxa" w:w="1701"/>
+          </w:tcPr>
+          <w:p>
+            <w:pPr>
+              <w:jc w:val="left"/>
+            </w:pPr>
+            <w:r/>
+            <w:r>
+              <w:t>250660121107</w:t>
+            </w:r>
+          </w:p>
+        </w:tc>
+        <w:tc>
+          <w:tcPr>
+            <w:tcW w:type="dxa" w:w="4422"/>
+          </w:tcPr>
+          <w:p>
+            <w:pPr>
+              <w:jc w:val="left"/>
+            </w:pPr>
+            <w:r/>
+            <w:r>
+              <w:t>Memeriksa hitungan manual tiap algoritma dan format Daftar Pustaka</w:t>
             </w:r>
           </w:p>
         </w:tc>

</xml_diff>

<commit_message>
Rapikan struktur: laporan dirakit ulang dengan tiga anggota
report.py sekarang memuat daftar anggota dan tautan portofolio, jadi
merakit ulang laporan tidak menghilangkan isian manual.

Co-Authored-By: Claude Code <noreply@anthropic.com>
</commit_message>
<xml_diff>
--- a/results/IF-3C_K-2_250660121068_Dendy Zainal Mutaqien.docx
+++ b/results/IF-3C_K-2_250660121068_Dendy Zainal Mutaqien.docx
@@ -306,13 +306,12 @@
               <w:spacing w:before="40" w:after="40"/>
               <w:jc w:val="left"/>
             </w:pPr>
-            <w:r>
+            <w:r/>
+            <w:r>
+              <w:rPr>
+                <w:sz w:val="19"/>
+              </w:rPr>
               <w:t>3 orang — Dendy Zainal Mutaqien, R.Sangga Buana, M.Azkal Azkiya (rincian di Lampiran D)</w:t>
-            </w:r>
-            <w:r>
-              <w:rPr>
-                <w:sz w:val="19"/>
-              </w:rPr>
             </w:r>
           </w:p>
         </w:tc>
@@ -7006,13 +7005,12 @@
               <w:spacing w:before="40" w:after="40"/>
               <w:jc w:val="left"/>
             </w:pPr>
-            <w:r>
+            <w:r/>
+            <w:r>
+              <w:rPr>
+                <w:sz w:val="18"/>
+              </w:rPr>
               <w:t>https://github.com/ZzDendy/so-k2-penjadwalan</w:t>
-            </w:r>
-            <w:r>
-              <w:rPr>
-                <w:sz w:val="18"/>
-              </w:rPr>
             </w:r>
           </w:p>
         </w:tc>
@@ -10086,16 +10084,23 @@
         </w:tc>
       </w:tr>
       <w:tr>
+        <w:trPr>
+          <w:cantSplit/>
+        </w:trPr>
         <w:tc>
           <w:tcPr>
             <w:tcW w:type="dxa" w:w="2494"/>
           </w:tcPr>
           <w:p>
             <w:pPr>
-              <w:jc w:val="left"/>
-            </w:pPr>
-            <w:r/>
-            <w:r>
+              <w:spacing w:before="40" w:after="40"/>
+              <w:jc w:val="left"/>
+            </w:pPr>
+            <w:r/>
+            <w:r>
+              <w:rPr>
+                <w:sz w:val="18"/>
+              </w:rPr>
               <w:t>Dendy Zainal Mutaqien</w:t>
             </w:r>
           </w:p>
@@ -10106,10 +10111,14 @@
           </w:tcPr>
           <w:p>
             <w:pPr>
-              <w:jc w:val="left"/>
-            </w:pPr>
-            <w:r/>
-            <w:r>
+              <w:spacing w:before="40" w:after="40"/>
+              <w:jc w:val="left"/>
+            </w:pPr>
+            <w:r/>
+            <w:r>
+              <w:rPr>
+                <w:sz w:val="18"/>
+              </w:rPr>
               <w:t>250660121068</w:t>
             </w:r>
           </w:p>
@@ -10120,26 +10129,37 @@
           </w:tcPr>
           <w:p>
             <w:pPr>
-              <w:jc w:val="left"/>
-            </w:pPr>
-            <w:r/>
-            <w:r>
+              <w:spacing w:before="40" w:after="40"/>
+              <w:jc w:val="left"/>
+            </w:pPr>
+            <w:r/>
+            <w:r>
+              <w:rPr>
+                <w:sz w:val="18"/>
+              </w:rPr>
               <w:t>Simulator penjadwalan, perhitungan manual, dan penyusunan laporan</w:t>
             </w:r>
           </w:p>
         </w:tc>
       </w:tr>
       <w:tr>
+        <w:trPr>
+          <w:cantSplit/>
+        </w:trPr>
         <w:tc>
           <w:tcPr>
             <w:tcW w:type="dxa" w:w="2494"/>
           </w:tcPr>
           <w:p>
             <w:pPr>
-              <w:jc w:val="left"/>
-            </w:pPr>
-            <w:r/>
-            <w:r>
+              <w:spacing w:before="40" w:after="40"/>
+              <w:jc w:val="left"/>
+            </w:pPr>
+            <w:r/>
+            <w:r>
+              <w:rPr>
+                <w:sz w:val="18"/>
+              </w:rPr>
               <w:t>R.Sangga Buana</w:t>
             </w:r>
           </w:p>
@@ -10150,10 +10170,14 @@
           </w:tcPr>
           <w:p>
             <w:pPr>
-              <w:jc w:val="left"/>
-            </w:pPr>
-            <w:r/>
-            <w:r>
+              <w:spacing w:before="40" w:after="40"/>
+              <w:jc w:val="left"/>
+            </w:pPr>
+            <w:r/>
+            <w:r>
+              <w:rPr>
+                <w:sz w:val="18"/>
+              </w:rPr>
               <w:t>250660121021</w:t>
             </w:r>
           </w:p>
@@ -10164,26 +10188,37 @@
           </w:tcPr>
           <w:p>
             <w:pPr>
-              <w:jc w:val="left"/>
-            </w:pPr>
-            <w:r/>
-            <w:r>
+              <w:spacing w:before="40" w:after="40"/>
+              <w:jc w:val="left"/>
+            </w:pPr>
+            <w:r/>
+            <w:r>
+              <w:rPr>
+                <w:sz w:val="18"/>
+              </w:rPr>
               <w:t>Membuat Gantt chart keenam algoritma dan memeriksa angka Tabel 5.1</w:t>
             </w:r>
           </w:p>
         </w:tc>
       </w:tr>
       <w:tr>
+        <w:trPr>
+          <w:cantSplit/>
+        </w:trPr>
         <w:tc>
           <w:tcPr>
             <w:tcW w:type="dxa" w:w="2494"/>
           </w:tcPr>
           <w:p>
             <w:pPr>
-              <w:jc w:val="left"/>
-            </w:pPr>
-            <w:r/>
-            <w:r>
+              <w:spacing w:before="40" w:after="40"/>
+              <w:jc w:val="left"/>
+            </w:pPr>
+            <w:r/>
+            <w:r>
+              <w:rPr>
+                <w:sz w:val="18"/>
+              </w:rPr>
               <w:t>M.Azkal Azkiya</w:t>
             </w:r>
           </w:p>
@@ -10194,10 +10229,14 @@
           </w:tcPr>
           <w:p>
             <w:pPr>
-              <w:jc w:val="left"/>
-            </w:pPr>
-            <w:r/>
-            <w:r>
+              <w:spacing w:before="40" w:after="40"/>
+              <w:jc w:val="left"/>
+            </w:pPr>
+            <w:r/>
+            <w:r>
+              <w:rPr>
+                <w:sz w:val="18"/>
+              </w:rPr>
               <w:t>250660121107</w:t>
             </w:r>
           </w:p>
@@ -10208,10 +10247,14 @@
           </w:tcPr>
           <w:p>
             <w:pPr>
-              <w:jc w:val="left"/>
-            </w:pPr>
-            <w:r/>
-            <w:r>
+              <w:spacing w:before="40" w:after="40"/>
+              <w:jc w:val="left"/>
+            </w:pPr>
+            <w:r/>
+            <w:r>
+              <w:rPr>
+                <w:sz w:val="18"/>
+              </w:rPr>
               <w:t>Memeriksa hitungan manual tiap algoritma dan format Daftar Pustaka</w:t>
             </w:r>
           </w:p>

</xml_diff>